<commit_message>
Cleaner tutorial .docx: framed aligned images, consistent styling, fix stale text
- One unified builder for all three tutorials with a consistent look: accent section
  bars, equal-size framed image panels (fixes Tutorial 1's misaligned Target/Result),
  zebra-striped CSV table, tidy tips boxes.
- Fix outdated instructions: the removed 'Render' button is gone from the steps (preview
  updates live -> Save .bmp); note that Space/Opening depth gray out under a CSV; refer to
  the moved 'OPENING FROM CSV' section.
- Avoid a missing-glyph box in the PDF render. PDFs regenerated to match.
</commit_message>
<xml_diff>
--- a/docs/Tutorial-1-mask-profile.docx
+++ b/docs/Tutorial-1-mask-profile.docx
@@ -4,56 +4,69 @@
   <w:body>
     <w:p>
       <w:pPr>
-        <w:spacing w:after="20"/>
-      </w:pPr>
-      <w:r>
-        <w:rPr>
-          <w:rFonts w:ascii="Arial" w:cs="Arial" w:eastAsia="Arial" w:hAnsi="Arial"/>
-          <w:b/>
-          <w:bCs/>
-          <w:color w:val="4E6E9E"/>
-          <w:sz w:val="17"/>
-          <w:szCs w:val="17"/>
+        <w:spacing w:after="30"/>
+      </w:pPr>
+      <w:r>
+        <w:rPr>
+          <w:rFonts w:ascii="Arial" w:cs="Arial" w:eastAsia="Arial" w:hAnsi="Arial"/>
+          <w:b/>
+          <w:bCs/>
+          <w:color w:val="3E5C86"/>
+          <w:spacing w:val="20"/>
+          <w:sz w:val="16"/>
+          <w:szCs w:val="16"/>
         </w:rPr>
         <w:t xml:space="preserve">SANDBOX · PROFILE STUDIO — TUTORIAL 1</w:t>
       </w:r>
     </w:p>
     <w:p>
       <w:pPr>
-        <w:spacing w:after="40"/>
-      </w:pPr>
-      <w:r>
-        <w:rPr>
-          <w:rFonts w:ascii="Arial" w:cs="Arial" w:eastAsia="Arial" w:hAnsi="Arial"/>
-          <w:b/>
-          <w:bCs/>
-          <w:color w:val="0E1B2E"/>
-          <w:sz w:val="40"/>
-          <w:szCs w:val="40"/>
+        <w:spacing w:after="60"/>
+      </w:pPr>
+      <w:r>
+        <w:rPr>
+          <w:rFonts w:ascii="Arial" w:cs="Arial" w:eastAsia="Arial" w:hAnsi="Arial"/>
+          <w:b/>
+          <w:bCs/>
+          <w:color w:val="12233B"/>
+          <w:sz w:val="38"/>
+          <w:szCs w:val="38"/>
         </w:rPr>
         <w:t xml:space="preserve">Building a U-shaped mask profile</w:t>
       </w:r>
     </w:p>
     <w:p>
       <w:pPr>
+        <w:spacing w:after="60"/>
+      </w:pPr>
+      <w:r>
+        <w:rPr>
+          <w:rFonts w:ascii="Arial" w:cs="Arial" w:eastAsia="Arial" w:hAnsi="Arial"/>
+          <w:color w:val="6B7A8D"/>
+          <w:sz w:val="20"/>
+          <w:szCs w:val="20"/>
+        </w:rPr>
+        <w:t xml:space="preserve">Reproduce a flared mask with a rounded (U) opening bottom using the material stack and per-layer shape treatments.</w:t>
+      </w:r>
+    </w:p>
+    <w:p>
+      <w:pPr>
         <w:pBdr>
-          <w:bottom w:val="single" w:color="4E6E9E" w:sz="8" w:space="6"/>
+          <w:bottom w:val="single" w:color="CBD6E4" w:sz="6" w:space="8"/>
         </w:pBdr>
-        <w:spacing w:after="120"/>
-      </w:pPr>
-      <w:r>
-        <w:rPr>
-          <w:rFonts w:ascii="Arial" w:cs="Arial" w:eastAsia="Arial" w:hAnsi="Arial"/>
-          <w:color w:val="5C6B7E"/>
-          <w:sz w:val="21"/>
-          <w:szCs w:val="21"/>
-        </w:rPr>
-        <w:t xml:space="preserve">Reproduce a flared mask with a rounded (U) opening bottom, using the material stack and per-layer shape treatments.</w:t>
+        <w:spacing w:after="150"/>
+      </w:pPr>
+      <w:r>
+        <w:rPr>
+          <w:sz w:val="2"/>
+          <w:szCs w:val="2"/>
+        </w:rPr>
+        <w:t xml:space="preserve"/>
       </w:r>
     </w:p>
     <w:tbl>
       <w:tblPr>
-        <w:tblW w:type="dxa" w:w="10080"/>
+        <w:tblW w:type="dxa" w:w="10040"/>
         <w:tblBorders>
           <w:top w:val="none" w:color="FFFFFF" w:sz="0"/>
           <w:left w:val="none" w:color="FFFFFF" w:sz="0"/>
@@ -64,19 +77,28 @@
         </w:tblBorders>
       </w:tblPr>
       <w:tblGrid>
-        <w:gridCol w:w="5040"/>
-        <w:gridCol w:w="5040"/>
+        <w:gridCol w:w="4890"/>
+        <w:gridCol w:w="260"/>
+        <w:gridCol w:w="4890"/>
       </w:tblGrid>
       <w:tr>
         <w:tc>
           <w:tcPr>
-            <w:tcW w:type="dxa" w:w="5040"/>
+            <w:tcW w:type="dxa" w:w="4890"/>
             <w:tcBorders>
-              <w:top w:val="none" w:color="FFFFFF" w:sz="0"/>
-              <w:left w:val="none" w:color="FFFFFF" w:sz="0"/>
-              <w:bottom w:val="none" w:color="FFFFFF" w:sz="0"/>
-              <w:right w:val="none" w:color="FFFFFF" w:sz="0"/>
+              <w:top w:val="single" w:color="CBD6E4" w:sz="4"/>
+              <w:left w:val="single" w:color="CBD6E4" w:sz="4"/>
+              <w:bottom w:val="single" w:color="CBD6E4" w:sz="4"/>
+              <w:right w:val="single" w:color="CBD6E4" w:sz="4"/>
             </w:tcBorders>
+            <w:shd w:fill="F6F9FD" w:val="clear"/>
+            <w:tcMar>
+              <w:top w:type="dxa" w:w="90"/>
+              <w:left w:type="dxa" w:w="90"/>
+              <w:bottom w:type="dxa" w:w="70"/>
+              <w:right w:type="dxa" w:w="90"/>
+            </w:tcMar>
+            <w:vAlign w:val="center"/>
           </w:tcPr>
           <w:p>
             <w:pPr>
@@ -85,7 +107,7 @@
             <w:r>
               <w:drawing>
                 <wp:inline distT="0" distB="0" distL="0" distR="0">
-                  <wp:extent cx="2076450" cy="1628775"/>
+                  <wp:extent cx="2038350" cy="1600200"/>
                   <wp:effectExtent t="0" r="0" b="0" l="0"/>
                   <wp:docPr id="1" name="" descr="" title=""/>
                   <wp:cNvGraphicFramePr>
@@ -110,7 +132,7 @@
                         <pic:spPr bwMode="auto">
                           <a:xfrm>
                             <a:off x="0" y="0"/>
-                            <a:ext cx="2076450" cy="1628775"/>
+                            <a:ext cx="2038350" cy="1600200"/>
                           </a:xfrm>
                           <a:prstGeom prst="rect">
                             <a:avLst/>
@@ -125,7 +147,7 @@
           </w:p>
           <w:p>
             <w:pPr>
-              <w:spacing w:before="20"/>
+              <w:spacing w:before="60"/>
               <w:jc w:val="center"/>
             </w:pPr>
             <w:r>
@@ -133,17 +155,17 @@
                 <w:rFonts w:ascii="Arial" w:cs="Arial" w:eastAsia="Arial" w:hAnsi="Arial"/>
                 <w:i/>
                 <w:iCs/>
-                <w:color w:val="5C6B7E"/>
-                <w:sz w:val="17"/>
-                <w:szCs w:val="17"/>
+                <w:color w:val="6B7A8D"/>
+                <w:sz w:val="16"/>
+                <w:szCs w:val="16"/>
               </w:rPr>
-              <w:t xml:space="preserve">Target (your image)</w:t>
+              <w:t xml:space="preserve">Target — your image</w:t>
             </w:r>
           </w:p>
         </w:tc>
         <w:tc>
           <w:tcPr>
-            <w:tcW w:type="dxa" w:w="5040"/>
+            <w:tcW w:type="dxa" w:w="260"/>
             <w:tcBorders>
               <w:top w:val="none" w:color="FFFFFF" w:sz="0"/>
               <w:left w:val="none" w:color="FFFFFF" w:sz="0"/>
@@ -152,13 +174,41 @@
             </w:tcBorders>
           </w:tcPr>
           <w:p>
+            <w:r>
+              <w:rPr>
+                <w:sz w:val="2"/>
+                <w:szCs w:val="2"/>
+              </w:rPr>
+              <w:t xml:space="preserve"/>
+            </w:r>
+          </w:p>
+        </w:tc>
+        <w:tc>
+          <w:tcPr>
+            <w:tcW w:type="dxa" w:w="4890"/>
+            <w:tcBorders>
+              <w:top w:val="single" w:color="CBD6E4" w:sz="4"/>
+              <w:left w:val="single" w:color="CBD6E4" w:sz="4"/>
+              <w:bottom w:val="single" w:color="CBD6E4" w:sz="4"/>
+              <w:right w:val="single" w:color="CBD6E4" w:sz="4"/>
+            </w:tcBorders>
+            <w:shd w:fill="F6F9FD" w:val="clear"/>
+            <w:tcMar>
+              <w:top w:type="dxa" w:w="90"/>
+              <w:left w:type="dxa" w:w="90"/>
+              <w:bottom w:type="dxa" w:w="70"/>
+              <w:right w:type="dxa" w:w="90"/>
+            </w:tcMar>
+            <w:vAlign w:val="center"/>
+          </w:tcPr>
+          <w:p>
             <w:pPr>
               <w:jc w:val="center"/>
             </w:pPr>
             <w:r>
               <w:drawing>
                 <wp:inline distT="0" distB="0" distL="0" distR="0">
-                  <wp:extent cx="1571625" cy="1990725"/>
+                  <wp:extent cx="1257300" cy="1600200"/>
                   <wp:effectExtent t="0" r="0" b="0" l="0"/>
                   <wp:docPr id="1" name="" descr="" title=""/>
                   <wp:cNvGraphicFramePr>
@@ -183,7 +233,7 @@
                         <pic:spPr bwMode="auto">
                           <a:xfrm>
                             <a:off x="0" y="0"/>
-                            <a:ext cx="1571625" cy="1990725"/>
+                            <a:ext cx="1257300" cy="1600200"/>
                           </a:xfrm>
                           <a:prstGeom prst="rect">
                             <a:avLst/>
@@ -198,7 +248,7 @@
           </w:p>
           <w:p>
             <w:pPr>
-              <w:spacing w:before="20"/>
+              <w:spacing w:before="60"/>
               <w:jc w:val="center"/>
             </w:pPr>
             <w:r>
@@ -206,9 +256,9 @@
                 <w:rFonts w:ascii="Arial" w:cs="Arial" w:eastAsia="Arial" w:hAnsi="Arial"/>
                 <w:i/>
                 <w:iCs/>
-                <w:color w:val="5C6B7E"/>
-                <w:sz w:val="17"/>
-                <w:szCs w:val="17"/>
+                <w:color w:val="6B7A8D"/>
+                <w:sz w:val="16"/>
+                <w:szCs w:val="16"/>
               </w:rPr>
               <w:t xml:space="preserve">Result in Profile Studio</w:t>
             </w:r>
@@ -218,31 +268,40 @@
     </w:tbl>
     <w:p>
       <w:pPr>
-        <w:spacing w:after="60" w:before="140"/>
-      </w:pPr>
-      <w:r>
-        <w:rPr>
-          <w:rFonts w:ascii="Arial" w:cs="Arial" w:eastAsia="Arial" w:hAnsi="Arial"/>
-          <w:b/>
-          <w:bCs/>
-          <w:color w:val="0E1B2E"/>
+        <w:spacing w:after="70" w:before="170"/>
+      </w:pPr>
+      <w:r>
+        <w:rPr>
+          <w:rFonts w:ascii="Arial" w:cs="Arial" w:eastAsia="Arial" w:hAnsi="Arial"/>
+          <w:color w:val="2E9E77"/>
+          <w:sz w:val="22"/>
+          <w:szCs w:val="22"/>
+        </w:rPr>
+        <w:t xml:space="preserve">▍</w:t>
+      </w:r>
+      <w:r>
+        <w:rPr>
+          <w:rFonts w:ascii="Arial" w:cs="Arial" w:eastAsia="Arial" w:hAnsi="Arial"/>
+          <w:b/>
+          <w:bCs/>
+          <w:color w:val="12233B"/>
           <w:sz w:val="23"/>
           <w:szCs w:val="23"/>
         </w:rPr>
-        <w:t xml:space="preserve">Steps</w:t>
-      </w:r>
-    </w:p>
-    <w:p>
-      <w:pPr>
-        <w:spacing w:after="70"/>
-        <w:ind w:left="60"/>
-      </w:pPr>
-      <w:r>
-        <w:rPr>
-          <w:rFonts w:ascii="Arial" w:cs="Arial" w:eastAsia="Arial" w:hAnsi="Arial"/>
-          <w:b/>
-          <w:bCs/>
-          <w:color w:val="2FA37A"/>
+        <w:t xml:space="preserve"> Steps</w:t>
+      </w:r>
+    </w:p>
+    <w:p>
+      <w:pPr>
+        <w:spacing w:after="80"/>
+        <w:ind w:left="120"/>
+      </w:pPr>
+      <w:r>
+        <w:rPr>
+          <w:rFonts w:ascii="Arial" w:cs="Arial" w:eastAsia="Arial" w:hAnsi="Arial"/>
+          <w:b/>
+          <w:bCs/>
+          <w:color w:val="2E9E77"/>
           <w:sz w:val="20"/>
           <w:szCs w:val="20"/>
         </w:rPr>
@@ -253,7 +312,7 @@
           <w:rFonts w:ascii="Arial" w:cs="Arial" w:eastAsia="Arial" w:hAnsi="Arial"/>
           <w:b/>
           <w:bCs/>
-          <w:color w:val="1B2A3D"/>
+          <w:color w:val="1F2A38"/>
           <w:sz w:val="20"/>
           <w:szCs w:val="20"/>
         </w:rPr>
@@ -262,7 +321,7 @@
       <w:r>
         <w:rPr>
           <w:rFonts w:ascii="Arial" w:cs="Arial" w:eastAsia="Arial" w:hAnsi="Arial"/>
-          <w:color w:val="1B2A3D"/>
+          <w:color w:val="1F2A38"/>
           <w:sz w:val="20"/>
           <w:szCs w:val="20"/>
         </w:rPr>
@@ -273,7 +332,7 @@
           <w:rFonts w:ascii="Arial" w:cs="Arial" w:eastAsia="Arial" w:hAnsi="Arial"/>
           <w:b/>
           <w:bCs/>
-          <w:color w:val="1B2A3D"/>
+          <w:color w:val="1F2A38"/>
           <w:sz w:val="20"/>
           <w:szCs w:val="20"/>
         </w:rPr>
@@ -282,7 +341,7 @@
       <w:r>
         <w:rPr>
           <w:rFonts w:ascii="Arial" w:cs="Arial" w:eastAsia="Arial" w:hAnsi="Arial"/>
-          <w:color w:val="1B2A3D"/>
+          <w:color w:val="1F2A38"/>
           <w:sz w:val="20"/>
           <w:szCs w:val="20"/>
         </w:rPr>
@@ -293,7 +352,7 @@
           <w:rFonts w:ascii="Arial" w:cs="Arial" w:eastAsia="Arial" w:hAnsi="Arial"/>
           <w:b/>
           <w:bCs/>
-          <w:color w:val="1B2A3D"/>
+          <w:color w:val="1F2A38"/>
           <w:sz w:val="20"/>
           <w:szCs w:val="20"/>
         </w:rPr>
@@ -302,7 +361,7 @@
       <w:r>
         <w:rPr>
           <w:rFonts w:ascii="Arial" w:cs="Arial" w:eastAsia="Arial" w:hAnsi="Arial"/>
-          <w:color w:val="1B2A3D"/>
+          <w:color w:val="1F2A38"/>
           <w:sz w:val="20"/>
           <w:szCs w:val="20"/>
         </w:rPr>
@@ -311,15 +370,15 @@
     </w:p>
     <w:p>
       <w:pPr>
-        <w:spacing w:after="70"/>
-        <w:ind w:left="60"/>
-      </w:pPr>
-      <w:r>
-        <w:rPr>
-          <w:rFonts w:ascii="Arial" w:cs="Arial" w:eastAsia="Arial" w:hAnsi="Arial"/>
-          <w:b/>
-          <w:bCs/>
-          <w:color w:val="2FA37A"/>
+        <w:spacing w:after="80"/>
+        <w:ind w:left="120"/>
+      </w:pPr>
+      <w:r>
+        <w:rPr>
+          <w:rFonts w:ascii="Arial" w:cs="Arial" w:eastAsia="Arial" w:hAnsi="Arial"/>
+          <w:b/>
+          <w:bCs/>
+          <w:color w:val="2E9E77"/>
           <w:sz w:val="20"/>
           <w:szCs w:val="20"/>
         </w:rPr>
@@ -330,7 +389,7 @@
           <w:rFonts w:ascii="Arial" w:cs="Arial" w:eastAsia="Arial" w:hAnsi="Arial"/>
           <w:b/>
           <w:bCs/>
-          <w:color w:val="1B2A3D"/>
+          <w:color w:val="1F2A38"/>
           <w:sz w:val="20"/>
           <w:szCs w:val="20"/>
         </w:rPr>
@@ -339,7 +398,7 @@
       <w:r>
         <w:rPr>
           <w:rFonts w:ascii="Arial" w:cs="Arial" w:eastAsia="Arial" w:hAnsi="Arial"/>
-          <w:color w:val="1B2A3D"/>
+          <w:color w:val="1F2A38"/>
           <w:sz w:val="20"/>
           <w:szCs w:val="20"/>
         </w:rPr>
@@ -350,7 +409,7 @@
           <w:rFonts w:ascii="Arial" w:cs="Arial" w:eastAsia="Arial" w:hAnsi="Arial"/>
           <w:b/>
           <w:bCs/>
-          <w:color w:val="1B2A3D"/>
+          <w:color w:val="1F2A38"/>
           <w:sz w:val="20"/>
           <w:szCs w:val="20"/>
         </w:rPr>
@@ -359,7 +418,7 @@
       <w:r>
         <w:rPr>
           <w:rFonts w:ascii="Arial" w:cs="Arial" w:eastAsia="Arial" w:hAnsi="Arial"/>
-          <w:color w:val="1B2A3D"/>
+          <w:color w:val="1F2A38"/>
           <w:sz w:val="20"/>
           <w:szCs w:val="20"/>
         </w:rPr>
@@ -370,7 +429,7 @@
           <w:rFonts w:ascii="Arial" w:cs="Arial" w:eastAsia="Arial" w:hAnsi="Arial"/>
           <w:b/>
           <w:bCs/>
-          <w:color w:val="1B2A3D"/>
+          <w:color w:val="1F2A38"/>
           <w:sz w:val="20"/>
           <w:szCs w:val="20"/>
         </w:rPr>
@@ -379,7 +438,7 @@
       <w:r>
         <w:rPr>
           <w:rFonts w:ascii="Arial" w:cs="Arial" w:eastAsia="Arial" w:hAnsi="Arial"/>
-          <w:color w:val="1B2A3D"/>
+          <w:color w:val="1F2A38"/>
           <w:sz w:val="20"/>
           <w:szCs w:val="20"/>
         </w:rPr>
@@ -390,7 +449,7 @@
           <w:rFonts w:ascii="Arial" w:cs="Arial" w:eastAsia="Arial" w:hAnsi="Arial"/>
           <w:b/>
           <w:bCs/>
-          <w:color w:val="1B2A3D"/>
+          <w:color w:val="1F2A38"/>
           <w:sz w:val="20"/>
           <w:szCs w:val="20"/>
         </w:rPr>
@@ -399,7 +458,7 @@
       <w:r>
         <w:rPr>
           <w:rFonts w:ascii="Arial" w:cs="Arial" w:eastAsia="Arial" w:hAnsi="Arial"/>
-          <w:color w:val="1B2A3D"/>
+          <w:color w:val="1F2A38"/>
           <w:sz w:val="20"/>
           <w:szCs w:val="20"/>
         </w:rPr>
@@ -410,7 +469,7 @@
           <w:rFonts w:ascii="Arial" w:cs="Arial" w:eastAsia="Arial" w:hAnsi="Arial"/>
           <w:b/>
           <w:bCs/>
-          <w:color w:val="1B2A3D"/>
+          <w:color w:val="1F2A38"/>
           <w:sz w:val="20"/>
           <w:szCs w:val="20"/>
         </w:rPr>
@@ -419,7 +478,7 @@
       <w:r>
         <w:rPr>
           <w:rFonts w:ascii="Arial" w:cs="Arial" w:eastAsia="Arial" w:hAnsi="Arial"/>
-          <w:color w:val="1B2A3D"/>
+          <w:color w:val="1F2A38"/>
           <w:sz w:val="20"/>
           <w:szCs w:val="20"/>
         </w:rPr>
@@ -428,15 +487,15 @@
     </w:p>
     <w:p>
       <w:pPr>
-        <w:spacing w:after="70"/>
-        <w:ind w:left="60"/>
-      </w:pPr>
-      <w:r>
-        <w:rPr>
-          <w:rFonts w:ascii="Arial" w:cs="Arial" w:eastAsia="Arial" w:hAnsi="Arial"/>
-          <w:b/>
-          <w:bCs/>
-          <w:color w:val="2FA37A"/>
+        <w:spacing w:after="80"/>
+        <w:ind w:left="120"/>
+      </w:pPr>
+      <w:r>
+        <w:rPr>
+          <w:rFonts w:ascii="Arial" w:cs="Arial" w:eastAsia="Arial" w:hAnsi="Arial"/>
+          <w:b/>
+          <w:bCs/>
+          <w:color w:val="2E9E77"/>
           <w:sz w:val="20"/>
           <w:szCs w:val="20"/>
         </w:rPr>
@@ -447,7 +506,7 @@
           <w:rFonts w:ascii="Arial" w:cs="Arial" w:eastAsia="Arial" w:hAnsi="Arial"/>
           <w:b/>
           <w:bCs/>
-          <w:color w:val="1B2A3D"/>
+          <w:color w:val="1F2A38"/>
           <w:sz w:val="20"/>
           <w:szCs w:val="20"/>
         </w:rPr>
@@ -456,7 +515,7 @@
       <w:r>
         <w:rPr>
           <w:rFonts w:ascii="Arial" w:cs="Arial" w:eastAsia="Arial" w:hAnsi="Arial"/>
-          <w:color w:val="1B2A3D"/>
+          <w:color w:val="1F2A38"/>
           <w:sz w:val="20"/>
           <w:szCs w:val="20"/>
         </w:rPr>
@@ -465,15 +524,15 @@
     </w:p>
     <w:p>
       <w:pPr>
-        <w:spacing w:after="70"/>
-        <w:ind w:left="60"/>
-      </w:pPr>
-      <w:r>
-        <w:rPr>
-          <w:rFonts w:ascii="Arial" w:cs="Arial" w:eastAsia="Arial" w:hAnsi="Arial"/>
-          <w:b/>
-          <w:bCs/>
-          <w:color w:val="2FA37A"/>
+        <w:spacing w:after="80"/>
+        <w:ind w:left="120"/>
+      </w:pPr>
+      <w:r>
+        <w:rPr>
+          <w:rFonts w:ascii="Arial" w:cs="Arial" w:eastAsia="Arial" w:hAnsi="Arial"/>
+          <w:b/>
+          <w:bCs/>
+          <w:color w:val="2E9E77"/>
           <w:sz w:val="20"/>
           <w:szCs w:val="20"/>
         </w:rPr>
@@ -484,7 +543,7 @@
           <w:rFonts w:ascii="Arial" w:cs="Arial" w:eastAsia="Arial" w:hAnsi="Arial"/>
           <w:b/>
           <w:bCs/>
-          <w:color w:val="1B2A3D"/>
+          <w:color w:val="1F2A38"/>
           <w:sz w:val="20"/>
           <w:szCs w:val="20"/>
         </w:rPr>
@@ -493,18 +552,18 @@
       <w:r>
         <w:rPr>
           <w:rFonts w:ascii="Arial" w:cs="Arial" w:eastAsia="Arial" w:hAnsi="Arial"/>
-          <w:color w:val="1B2A3D"/>
-          <w:sz w:val="20"/>
-          <w:szCs w:val="20"/>
-        </w:rPr>
-        <w:t xml:space="preserve"> On the indigo layer press </w:t>
-      </w:r>
-      <w:r>
-        <w:rPr>
-          <w:rFonts w:ascii="Arial" w:cs="Arial" w:eastAsia="Arial" w:hAnsi="Arial"/>
-          <w:b/>
-          <w:bCs/>
-          <w:color w:val="1B2A3D"/>
+          <w:color w:val="1F2A38"/>
+          <w:sz w:val="20"/>
+          <w:szCs w:val="20"/>
+        </w:rPr>
+        <w:t xml:space="preserve"> On the indigo layer press its </w:t>
+      </w:r>
+      <w:r>
+        <w:rPr>
+          <w:rFonts w:ascii="Arial" w:cs="Arial" w:eastAsia="Arial" w:hAnsi="Arial"/>
+          <w:b/>
+          <w:bCs/>
+          <w:color w:val="1F2A38"/>
           <w:sz w:val="20"/>
           <w:szCs w:val="20"/>
         </w:rPr>
@@ -513,18 +572,18 @@
       <w:r>
         <w:rPr>
           <w:rFonts w:ascii="Arial" w:cs="Arial" w:eastAsia="Arial" w:hAnsi="Arial"/>
-          <w:color w:val="1B2A3D"/>
-          <w:sz w:val="20"/>
-          <w:szCs w:val="20"/>
-        </w:rPr>
-        <w:t xml:space="preserve"> and add </w:t>
-      </w:r>
-      <w:r>
-        <w:rPr>
-          <w:rFonts w:ascii="Arial" w:cs="Arial" w:eastAsia="Arial" w:hAnsi="Arial"/>
-          <w:b/>
-          <w:bCs/>
-          <w:color w:val="1B2A3D"/>
+          <w:color w:val="1F2A38"/>
+          <w:sz w:val="20"/>
+          <w:szCs w:val="20"/>
+        </w:rPr>
+        <w:t xml:space="preserve"> button and add </w:t>
+      </w:r>
+      <w:r>
+        <w:rPr>
+          <w:rFonts w:ascii="Arial" w:cs="Arial" w:eastAsia="Arial" w:hAnsi="Arial"/>
+          <w:b/>
+          <w:bCs/>
+          <w:color w:val="1F2A38"/>
           <w:sz w:val="20"/>
           <w:szCs w:val="20"/>
         </w:rPr>
@@ -533,7 +592,7 @@
       <w:r>
         <w:rPr>
           <w:rFonts w:ascii="Arial" w:cs="Arial" w:eastAsia="Arial" w:hAnsi="Arial"/>
-          <w:color w:val="1B2A3D"/>
+          <w:color w:val="1F2A38"/>
           <w:sz w:val="20"/>
           <w:szCs w:val="20"/>
         </w:rPr>
@@ -544,7 +603,7 @@
           <w:rFonts w:ascii="Arial" w:cs="Arial" w:eastAsia="Arial" w:hAnsi="Arial"/>
           <w:b/>
           <w:bCs/>
-          <w:color w:val="1B2A3D"/>
+          <w:color w:val="1F2A38"/>
           <w:sz w:val="20"/>
           <w:szCs w:val="20"/>
         </w:rPr>
@@ -553,7 +612,7 @@
       <w:r>
         <w:rPr>
           <w:rFonts w:ascii="Arial" w:cs="Arial" w:eastAsia="Arial" w:hAnsi="Arial"/>
-          <w:color w:val="1B2A3D"/>
+          <w:color w:val="1F2A38"/>
           <w:sz w:val="20"/>
           <w:szCs w:val="20"/>
         </w:rPr>
@@ -562,15 +621,15 @@
     </w:p>
     <w:p>
       <w:pPr>
-        <w:spacing w:after="70"/>
-        <w:ind w:left="60"/>
-      </w:pPr>
-      <w:r>
-        <w:rPr>
-          <w:rFonts w:ascii="Arial" w:cs="Arial" w:eastAsia="Arial" w:hAnsi="Arial"/>
-          <w:b/>
-          <w:bCs/>
-          <w:color w:val="2FA37A"/>
+        <w:spacing w:after="80"/>
+        <w:ind w:left="120"/>
+      </w:pPr>
+      <w:r>
+        <w:rPr>
+          <w:rFonts w:ascii="Arial" w:cs="Arial" w:eastAsia="Arial" w:hAnsi="Arial"/>
+          <w:b/>
+          <w:bCs/>
+          <w:color w:val="2E9E77"/>
           <w:sz w:val="20"/>
           <w:szCs w:val="20"/>
         </w:rPr>
@@ -579,47 +638,27 @@
       <w:r>
         <w:rPr>
           <w:rFonts w:ascii="Arial" w:cs="Arial" w:eastAsia="Arial" w:hAnsi="Arial"/>
-          <w:color w:val="1B2A3D"/>
-          <w:sz w:val="20"/>
-          <w:szCs w:val="20"/>
-        </w:rPr>
-        <w:t xml:space="preserve">Press </w:t>
-      </w:r>
-      <w:r>
-        <w:rPr>
-          <w:rFonts w:ascii="Arial" w:cs="Arial" w:eastAsia="Arial" w:hAnsi="Arial"/>
-          <w:b/>
-          <w:bCs/>
-          <w:color w:val="1B2A3D"/>
-          <w:sz w:val="20"/>
-          <w:szCs w:val="20"/>
-        </w:rPr>
-        <w:t xml:space="preserve">Render</w:t>
-      </w:r>
-      <w:r>
-        <w:rPr>
-          <w:rFonts w:ascii="Arial" w:cs="Arial" w:eastAsia="Arial" w:hAnsi="Arial"/>
-          <w:color w:val="1B2A3D"/>
-          <w:sz w:val="20"/>
-          <w:szCs w:val="20"/>
-        </w:rPr>
-        <w:t xml:space="preserve">, then </w:t>
-      </w:r>
-      <w:r>
-        <w:rPr>
-          <w:rFonts w:ascii="Arial" w:cs="Arial" w:eastAsia="Arial" w:hAnsi="Arial"/>
-          <w:b/>
-          <w:bCs/>
-          <w:color w:val="1B2A3D"/>
-          <w:sz w:val="20"/>
-          <w:szCs w:val="20"/>
-        </w:rPr>
-        <w:t xml:space="preserve">Save .bmp</w:t>
-      </w:r>
-      <w:r>
-        <w:rPr>
-          <w:rFonts w:ascii="Arial" w:cs="Arial" w:eastAsia="Arial" w:hAnsi="Arial"/>
-          <w:color w:val="1B2A3D"/>
+          <w:color w:val="1F2A38"/>
+          <w:sz w:val="20"/>
+          <w:szCs w:val="20"/>
+        </w:rPr>
+        <w:t xml:space="preserve">The preview updates live as you edit — click </w:t>
+      </w:r>
+      <w:r>
+        <w:rPr>
+          <w:rFonts w:ascii="Arial" w:cs="Arial" w:eastAsia="Arial" w:hAnsi="Arial"/>
+          <w:b/>
+          <w:bCs/>
+          <w:color w:val="1F2A38"/>
+          <w:sz w:val="20"/>
+          <w:szCs w:val="20"/>
+        </w:rPr>
+        <w:t xml:space="preserve">Save .bmp…</w:t>
+      </w:r>
+      <w:r>
+        <w:rPr>
+          <w:rFonts w:ascii="Arial" w:cs="Arial" w:eastAsia="Arial" w:hAnsi="Arial"/>
+          <w:color w:val="1F2A38"/>
           <w:sz w:val="20"/>
           <w:szCs w:val="20"/>
         </w:rPr>
@@ -628,55 +667,128 @@
     </w:p>
     <w:p>
       <w:pPr>
-        <w:spacing w:after="60" w:before="140"/>
-      </w:pPr>
-      <w:r>
-        <w:rPr>
-          <w:rFonts w:ascii="Arial" w:cs="Arial" w:eastAsia="Arial" w:hAnsi="Arial"/>
-          <w:b/>
-          <w:bCs/>
-          <w:color w:val="0E1B2E"/>
+        <w:spacing w:after="70" w:before="170"/>
+      </w:pPr>
+      <w:r>
+        <w:rPr>
+          <w:rFonts w:ascii="Arial" w:cs="Arial" w:eastAsia="Arial" w:hAnsi="Arial"/>
+          <w:color w:val="2E9E77"/>
+          <w:sz w:val="22"/>
+          <w:szCs w:val="22"/>
+        </w:rPr>
+        <w:t xml:space="preserve">▍</w:t>
+      </w:r>
+      <w:r>
+        <w:rPr>
+          <w:rFonts w:ascii="Arial" w:cs="Arial" w:eastAsia="Arial" w:hAnsi="Arial"/>
+          <w:b/>
+          <w:bCs/>
+          <w:color w:val="12233B"/>
           <w:sz w:val="23"/>
           <w:szCs w:val="23"/>
         </w:rPr>
-        <w:t xml:space="preserve">Notes</w:t>
+        <w:t xml:space="preserve"> How the shape treatments work</w:t>
       </w:r>
     </w:p>
     <w:p>
       <w:pPr>
         <w:spacing w:after="60"/>
-      </w:pPr>
-      <w:r>
-        <w:rPr>
-          <w:rFonts w:ascii="Arial" w:cs="Arial" w:eastAsia="Arial" w:hAnsi="Arial"/>
-          <w:b/>
-          <w:bCs/>
-          <w:color w:val="1B2A3D"/>
-          <w:sz w:val="20"/>
-          <w:szCs w:val="20"/>
-        </w:rPr>
-        <w:t xml:space="preserve">Round / Taper / Opening-bottom-round</w:t>
-      </w:r>
-      <w:r>
-        <w:rPr>
-          <w:rFonts w:ascii="Arial" w:cs="Arial" w:eastAsia="Arial" w:hAnsi="Arial"/>
-          <w:color w:val="1B2A3D"/>
-          <w:sz w:val="20"/>
-          <w:szCs w:val="20"/>
-        </w:rPr>
-        <w:t xml:space="preserve"> each shape a different part: round softens the top corner, taper slopes the whole wall, and the opening-bottom-round curves the base.</w:t>
+        <w:ind w:left="120"/>
+      </w:pPr>
+      <w:r>
+        <w:rPr>
+          <w:rFonts w:ascii="Arial" w:cs="Arial" w:eastAsia="Arial" w:hAnsi="Arial"/>
+          <w:b/>
+          <w:bCs/>
+          <w:color w:val="2E9E77"/>
+          <w:sz w:val="20"/>
+          <w:szCs w:val="20"/>
+        </w:rPr>
+        <w:t xml:space="preserve">•  </w:t>
+      </w:r>
+      <w:r>
+        <w:rPr>
+          <w:rFonts w:ascii="Arial" w:cs="Arial" w:eastAsia="Arial" w:hAnsi="Arial"/>
+          <w:b/>
+          <w:bCs/>
+          <w:color w:val="1F2A38"/>
+          <w:sz w:val="20"/>
+          <w:szCs w:val="20"/>
+        </w:rPr>
+        <w:t xml:space="preserve">Round</w:t>
+      </w:r>
+      <w:r>
+        <w:rPr>
+          <w:rFonts w:ascii="Arial" w:cs="Arial" w:eastAsia="Arial" w:hAnsi="Arial"/>
+          <w:color w:val="1F2A38"/>
+          <w:sz w:val="20"/>
+          <w:szCs w:val="20"/>
+        </w:rPr>
+        <w:t xml:space="preserve"> softens the top corner, </w:t>
+      </w:r>
+      <w:r>
+        <w:rPr>
+          <w:rFonts w:ascii="Arial" w:cs="Arial" w:eastAsia="Arial" w:hAnsi="Arial"/>
+          <w:b/>
+          <w:bCs/>
+          <w:color w:val="1F2A38"/>
+          <w:sz w:val="20"/>
+          <w:szCs w:val="20"/>
+        </w:rPr>
+        <w:t xml:space="preserve">Taper</w:t>
+      </w:r>
+      <w:r>
+        <w:rPr>
+          <w:rFonts w:ascii="Arial" w:cs="Arial" w:eastAsia="Arial" w:hAnsi="Arial"/>
+          <w:color w:val="1F2A38"/>
+          <w:sz w:val="20"/>
+          <w:szCs w:val="20"/>
+        </w:rPr>
+        <w:t xml:space="preserve"> slopes the whole wall, and </w:t>
+      </w:r>
+      <w:r>
+        <w:rPr>
+          <w:rFonts w:ascii="Arial" w:cs="Arial" w:eastAsia="Arial" w:hAnsi="Arial"/>
+          <w:b/>
+          <w:bCs/>
+          <w:color w:val="1F2A38"/>
+          <w:sz w:val="20"/>
+          <w:szCs w:val="20"/>
+        </w:rPr>
+        <w:t xml:space="preserve">Opening bottom round</w:t>
+      </w:r>
+      <w:r>
+        <w:rPr>
+          <w:rFonts w:ascii="Arial" w:cs="Arial" w:eastAsia="Arial" w:hAnsi="Arial"/>
+          <w:color w:val="1F2A38"/>
+          <w:sz w:val="20"/>
+          <w:szCs w:val="20"/>
+        </w:rPr>
+        <w:t xml:space="preserve"> curves the base — each shapes a different part.</w:t>
       </w:r>
     </w:p>
     <w:p>
       <w:pPr>
         <w:spacing w:after="60"/>
-      </w:pPr>
-      <w:r>
-        <w:rPr>
-          <w:rFonts w:ascii="Arial" w:cs="Arial" w:eastAsia="Arial" w:hAnsi="Arial"/>
-          <w:b/>
-          <w:bCs/>
-          <w:color w:val="1B2A3D"/>
+        <w:ind w:left="120"/>
+      </w:pPr>
+      <w:r>
+        <w:rPr>
+          <w:rFonts w:ascii="Arial" w:cs="Arial" w:eastAsia="Arial" w:hAnsi="Arial"/>
+          <w:b/>
+          <w:bCs/>
+          <w:color w:val="2E9E77"/>
+          <w:sz w:val="20"/>
+          <w:szCs w:val="20"/>
+        </w:rPr>
+        <w:t xml:space="preserve">•  </w:t>
+      </w:r>
+      <w:r>
+        <w:rPr>
+          <w:rFonts w:ascii="Arial" w:cs="Arial" w:eastAsia="Arial" w:hAnsi="Arial"/>
+          <w:b/>
+          <w:bCs/>
+          <w:color w:val="1F2A38"/>
           <w:sz w:val="20"/>
           <w:szCs w:val="20"/>
         </w:rPr>
@@ -685,18 +797,18 @@
       <w:r>
         <w:rPr>
           <w:rFonts w:ascii="Arial" w:cs="Arial" w:eastAsia="Arial" w:hAnsi="Arial"/>
-          <w:color w:val="1B2A3D"/>
-          <w:sz w:val="20"/>
-          <w:szCs w:val="20"/>
-        </w:rPr>
-        <w:t xml:space="preserve"> (optional here) slopes the whole wall; its angle is the sidewall angle from the horizontal base — </w:t>
-      </w:r>
-      <w:r>
-        <w:rPr>
-          <w:rFonts w:ascii="Arial" w:cs="Arial" w:eastAsia="Arial" w:hAnsi="Arial"/>
-          <w:b/>
-          <w:bCs/>
-          <w:color w:val="1B2A3D"/>
+          <w:color w:val="1F2A38"/>
+          <w:sz w:val="20"/>
+          <w:szCs w:val="20"/>
+        </w:rPr>
+        <w:t xml:space="preserve"> angle is the sidewall angle from the horizontal base: </w:t>
+      </w:r>
+      <w:r>
+        <w:rPr>
+          <w:rFonts w:ascii="Arial" w:cs="Arial" w:eastAsia="Arial" w:hAnsi="Arial"/>
+          <w:b/>
+          <w:bCs/>
+          <w:color w:val="1F2A38"/>
           <w:sz w:val="20"/>
           <w:szCs w:val="20"/>
         </w:rPr>
@@ -705,21 +817,33 @@
       <w:r>
         <w:rPr>
           <w:rFonts w:ascii="Arial" w:cs="Arial" w:eastAsia="Arial" w:hAnsi="Arial"/>
-          <w:color w:val="1B2A3D"/>
-          <w:sz w:val="20"/>
-          <w:szCs w:val="20"/>
-        </w:rPr>
-        <w:t xml:space="preserve">, smaller = more sloped.</w:t>
+          <w:color w:val="1F2A38"/>
+          <w:sz w:val="20"/>
+          <w:szCs w:val="20"/>
+        </w:rPr>
+        <w:t xml:space="preserve">, smaller = more sloped. (Not needed for this mask.)</w:t>
       </w:r>
     </w:p>
     <w:p>
       <w:pPr>
         <w:spacing w:after="60"/>
-      </w:pPr>
-      <w:r>
-        <w:rPr>
-          <w:rFonts w:ascii="Arial" w:cs="Arial" w:eastAsia="Arial" w:hAnsi="Arial"/>
-          <w:color w:val="1B2A3D"/>
+        <w:ind w:left="120"/>
+      </w:pPr>
+      <w:r>
+        <w:rPr>
+          <w:rFonts w:ascii="Arial" w:cs="Arial" w:eastAsia="Arial" w:hAnsi="Arial"/>
+          <w:b/>
+          <w:bCs/>
+          <w:color w:val="2E9E77"/>
+          <w:sz w:val="20"/>
+          <w:szCs w:val="20"/>
+        </w:rPr>
+        <w:t xml:space="preserve">•  </w:t>
+      </w:r>
+      <w:r>
+        <w:rPr>
+          <w:rFonts w:ascii="Arial" w:cs="Arial" w:eastAsia="Arial" w:hAnsi="Arial"/>
+          <w:color w:val="1F2A38"/>
           <w:sz w:val="20"/>
           <w:szCs w:val="20"/>
         </w:rPr>
@@ -730,7 +854,7 @@
           <w:rFonts w:ascii="Arial" w:cs="Arial" w:eastAsia="Arial" w:hAnsi="Arial"/>
           <w:b/>
           <w:bCs/>
-          <w:color w:val="1B2A3D"/>
+          <w:color w:val="1F2A38"/>
           <w:sz w:val="20"/>
           <w:szCs w:val="20"/>
         </w:rPr>
@@ -739,7 +863,7 @@
       <w:r>
         <w:rPr>
           <w:rFonts w:ascii="Arial" w:cs="Arial" w:eastAsia="Arial" w:hAnsi="Arial"/>
-          <w:color w:val="1B2A3D"/>
+          <w:color w:val="1F2A38"/>
           <w:sz w:val="20"/>
           <w:szCs w:val="20"/>
         </w:rPr>
@@ -750,7 +874,7 @@
           <w:rFonts w:ascii="Arial" w:cs="Arial" w:eastAsia="Arial" w:hAnsi="Arial"/>
           <w:b/>
           <w:bCs/>
-          <w:color w:val="1B2A3D"/>
+          <w:color w:val="1F2A38"/>
           <w:sz w:val="20"/>
           <w:szCs w:val="20"/>
         </w:rPr>
@@ -759,52 +883,62 @@
       <w:r>
         <w:rPr>
           <w:rFonts w:ascii="Arial" w:cs="Arial" w:eastAsia="Arial" w:hAnsi="Arial"/>
-          <w:color w:val="1B2A3D"/>
-          <w:sz w:val="20"/>
-          <w:szCs w:val="20"/>
-        </w:rPr>
-        <w:t xml:space="preserve"> — you get the same mask whichever you add first.</w:t>
+          <w:color w:val="1F2A38"/>
+          <w:sz w:val="20"/>
+          <w:szCs w:val="20"/>
+        </w:rPr>
+        <w:t xml:space="preserve"> — the mask is the same whichever you add first.</w:t>
       </w:r>
     </w:p>
     <w:p>
       <w:pPr>
         <w:spacing w:after="60"/>
       </w:pPr>
+      <w:r>
+        <w:rPr>
+          <w:sz w:val="2"/>
+          <w:szCs w:val="2"/>
+        </w:rPr>
+        <w:t xml:space="preserve"/>
+      </w:r>
     </w:p>
     <w:tbl>
       <w:tblPr>
-        <w:tblW w:type="dxa" w:w="10080"/>
+        <w:tblW w:type="dxa" w:w="10040"/>
         <w:tblBorders>
-          <w:top w:val="single" w:color="2FA37A" w:sz="4"/>
-          <w:left w:val="single" w:color="2FA37A" w:sz="4"/>
-          <w:bottom w:val="single" w:color="2FA37A" w:sz="4"/>
-          <w:right w:val="single" w:color="2FA37A" w:sz="4"/>
+          <w:top w:val="single" w:color="2E9E77" w:sz="4"/>
+          <w:left w:val="single" w:color="2E9E77" w:sz="4"/>
+          <w:bottom w:val="single" w:color="2E9E77" w:sz="4"/>
+          <w:right w:val="single" w:color="2E9E77" w:sz="4"/>
           <w:insideH w:val="single" w:color="auto" w:sz="4"/>
           <w:insideV w:val="single" w:color="auto" w:sz="4"/>
         </w:tblBorders>
       </w:tblPr>
       <w:tblGrid>
-        <w:gridCol w:w="10080"/>
+        <w:gridCol w:w="10040"/>
       </w:tblGrid>
       <w:tr>
         <w:tc>
           <w:tcPr>
-            <w:tcW w:type="dxa" w:w="10080"/>
-            <w:shd w:fill="E7F6EF" w:val="clear"/>
+            <w:tcW w:type="dxa" w:w="10040"/>
+            <w:shd w:fill="EAF6F0" w:val="clear"/>
             <w:tcMar>
-              <w:top w:type="dxa" w:w="80"/>
-              <w:left w:type="dxa" w:w="120"/>
-              <w:bottom w:type="dxa" w:w="80"/>
-              <w:right w:type="dxa" w:w="120"/>
+              <w:top w:type="dxa" w:w="110"/>
+              <w:left w:type="dxa" w:w="150"/>
+              <w:bottom w:type="dxa" w:w="110"/>
+              <w:right w:type="dxa" w:w="150"/>
             </w:tcMar>
           </w:tcPr>
           <w:p>
+            <w:pPr>
+              <w:spacing w:after="30"/>
+            </w:pPr>
             <w:r>
               <w:rPr>
                 <w:rFonts w:ascii="Arial" w:cs="Arial" w:eastAsia="Arial" w:hAnsi="Arial"/>
                 <w:b/>
                 <w:bCs/>
-                <w:color w:val="1B2A3D"/>
+                <w:color w:val="12233B"/>
                 <w:sz w:val="19"/>
                 <w:szCs w:val="19"/>
               </w:rPr>
@@ -813,44 +947,47 @@
           </w:p>
           <w:p>
             <w:pPr>
-              <w:spacing w:before="20"/>
+              <w:spacing w:before="24"/>
+              <w:ind w:left="80"/>
             </w:pPr>
             <w:r>
               <w:rPr>
                 <w:rFonts w:ascii="Arial" w:cs="Arial" w:eastAsia="Arial" w:hAnsi="Arial"/>
-                <w:color w:val="1B2A3D"/>
+                <w:color w:val="1F2A38"/>
                 <w:sz w:val="18"/>
                 <w:szCs w:val="18"/>
               </w:rPr>
-              <w:t xml:space="preserve">•  The shape button is enabled only for layers the opening actually reaches.</w:t>
+              <w:t xml:space="preserve">•  The shape button on a layer row is enabled only for layers the opening actually reaches.</w:t>
             </w:r>
           </w:p>
           <w:p>
             <w:pPr>
-              <w:spacing w:before="20"/>
+              <w:spacing w:before="24"/>
+              <w:ind w:left="80"/>
             </w:pPr>
             <w:r>
               <w:rPr>
                 <w:rFonts w:ascii="Arial" w:cs="Arial" w:eastAsia="Arial" w:hAnsi="Arial"/>
-                <w:color w:val="1B2A3D"/>
+                <w:color w:val="1F2A38"/>
                 <w:sz w:val="18"/>
                 <w:szCs w:val="18"/>
               </w:rPr>
-              <w:t xml:space="preserve">•  Toolbar Save stores the whole project; Save .bmp exports the picture.</w:t>
+              <w:t xml:space="preserve">•  Toolbar Save stores the whole project; Save .bmp exports just the picture.</w:t>
             </w:r>
           </w:p>
           <w:p>
             <w:pPr>
-              <w:spacing w:before="20"/>
+              <w:spacing w:before="24"/>
+              <w:ind w:left="80"/>
             </w:pPr>
             <w:r>
               <w:rPr>
                 <w:rFonts w:ascii="Arial" w:cs="Arial" w:eastAsia="Arial" w:hAnsi="Arial"/>
-                <w:color w:val="1B2A3D"/>
+                <w:color w:val="1F2A38"/>
                 <w:sz w:val="18"/>
                 <w:szCs w:val="18"/>
               </w:rPr>
-              <w:t xml:space="preserve">•  Add your own colors with the “+ New material” button.</w:t>
+              <w:t xml:space="preserve">•  Add your own colors with the “＋ New material (color)” button.</w:t>
             </w:r>
           </w:p>
         </w:tc>
@@ -858,7 +995,7 @@
     </w:tbl>
     <w:sectPr>
       <w:pgSz w:w="12240" w:h="15840" w:orient="portrait"/>
-      <w:pgMar w:top="900" w:right="1080" w:bottom="720" w:left="1080" w:header="708" w:footer="708" w:gutter="0"/>
+      <w:pgMar w:top="1000" w:right="1100" w:bottom="800" w:left="1100" w:header="708" w:footer="708" w:gutter="0"/>
       <w:pgNumType/>
       <w:docGrid w:linePitch="360"/>
     </w:sectPr>

</xml_diff>

<commit_message>
Tutorials: fill overfill + full-palette deposit/fill, explicit multi-treatment stacking
Tutorial 1 spells out stacking several treatments (Round + Taper via + Add another
treatment) and notes the Measure and Polygons tools. Tutorial 3 corrects Fill (flush
by default, number = overfill) and that Deposit/Fill accept any palette material.
PDFs regenerated.
</commit_message>
<xml_diff>
--- a/docs/Tutorial-1-mask-profile.docx
+++ b/docs/Tutorial-1-mask-profile.docx
@@ -847,47 +847,67 @@
           <w:sz w:val="20"/>
           <w:szCs w:val="20"/>
         </w:rPr>
-        <w:t xml:space="preserve">Treatments </w:t>
-      </w:r>
-      <w:r>
-        <w:rPr>
-          <w:rFonts w:ascii="Arial" w:cs="Arial" w:eastAsia="Arial" w:hAnsi="Arial"/>
-          <w:b/>
-          <w:bCs/>
-          <w:color w:val="1F2A38"/>
-          <w:sz w:val="20"/>
-          <w:szCs w:val="20"/>
-        </w:rPr>
-        <w:t xml:space="preserve">combine</w:t>
-      </w:r>
-      <w:r>
-        <w:rPr>
-          <w:rFonts w:ascii="Arial" w:cs="Arial" w:eastAsia="Arial" w:hAnsi="Arial"/>
-          <w:color w:val="1F2A38"/>
-          <w:sz w:val="20"/>
-          <w:szCs w:val="20"/>
-        </w:rPr>
-        <w:t xml:space="preserve"> and are </w:t>
-      </w:r>
-      <w:r>
-        <w:rPr>
-          <w:rFonts w:ascii="Arial" w:cs="Arial" w:eastAsia="Arial" w:hAnsi="Arial"/>
-          <w:b/>
-          <w:bCs/>
-          <w:color w:val="1F2A38"/>
-          <w:sz w:val="20"/>
-          <w:szCs w:val="20"/>
-        </w:rPr>
-        <w:t xml:space="preserve">order-independent</w:t>
-      </w:r>
-      <w:r>
-        <w:rPr>
-          <w:rFonts w:ascii="Arial" w:cs="Arial" w:eastAsia="Arial" w:hAnsi="Arial"/>
-          <w:color w:val="1F2A38"/>
-          <w:sz w:val="20"/>
-          <w:szCs w:val="20"/>
-        </w:rPr>
-        <w:t xml:space="preserve"> — the mask is the same whichever you add first.</w:t>
+        <w:t xml:space="preserve">You can </w:t>
+      </w:r>
+      <w:r>
+        <w:rPr>
+          <w:rFonts w:ascii="Arial" w:cs="Arial" w:eastAsia="Arial" w:hAnsi="Arial"/>
+          <w:b/>
+          <w:bCs/>
+          <w:color w:val="1F2A38"/>
+          <w:sz w:val="20"/>
+          <w:szCs w:val="20"/>
+        </w:rPr>
+        <w:t xml:space="preserve">stack several treatments</w:t>
+      </w:r>
+      <w:r>
+        <w:rPr>
+          <w:rFonts w:ascii="Arial" w:cs="Arial" w:eastAsia="Arial" w:hAnsi="Arial"/>
+          <w:color w:val="1F2A38"/>
+          <w:sz w:val="20"/>
+          <w:szCs w:val="20"/>
+        </w:rPr>
+        <w:t xml:space="preserve"> on one layer — e.g. </w:t>
+      </w:r>
+      <w:r>
+        <w:rPr>
+          <w:rFonts w:ascii="Arial" w:cs="Arial" w:eastAsia="Arial" w:hAnsi="Arial"/>
+          <w:b/>
+          <w:bCs/>
+          <w:color w:val="1F2A38"/>
+          <w:sz w:val="20"/>
+          <w:szCs w:val="20"/>
+        </w:rPr>
+        <w:t xml:space="preserve">Round + Taper</w:t>
+      </w:r>
+      <w:r>
+        <w:rPr>
+          <w:rFonts w:ascii="Arial" w:cs="Arial" w:eastAsia="Arial" w:hAnsi="Arial"/>
+          <w:color w:val="1F2A38"/>
+          <w:sz w:val="20"/>
+          <w:szCs w:val="20"/>
+        </w:rPr>
+        <w:t xml:space="preserve">. Use </w:t>
+      </w:r>
+      <w:r>
+        <w:rPr>
+          <w:rFonts w:ascii="Arial" w:cs="Arial" w:eastAsia="Arial" w:hAnsi="Arial"/>
+          <w:b/>
+          <w:bCs/>
+          <w:color w:val="1F2A38"/>
+          <w:sz w:val="20"/>
+          <w:szCs w:val="20"/>
+        </w:rPr>
+        <w:t xml:space="preserve">＋ Add another treatment</w:t>
+      </w:r>
+      <w:r>
+        <w:rPr>
+          <w:rFonts w:ascii="Arial" w:cs="Arial" w:eastAsia="Arial" w:hAnsi="Arial"/>
+          <w:color w:val="1F2A38"/>
+          <w:sz w:val="20"/>
+          <w:szCs w:val="20"/>
+        </w:rPr>
+        <w:t xml:space="preserve"> in the shape dialog. They combine and are order-independent.</w:t>
       </w:r>
     </w:p>
     <w:p>
@@ -990,6 +1010,21 @@
               <w:t xml:space="preserve">•  Add your own colors with the “＋ New material (color)” button.</w:t>
             </w:r>
           </w:p>
+          <w:p>
+            <w:pPr>
+              <w:spacing w:before="24"/>
+              <w:ind w:left="80"/>
+            </w:pPr>
+            <w:r>
+              <w:rPr>
+                <w:rFonts w:ascii="Arial" w:cs="Arial" w:eastAsia="Arial" w:hAnsi="Arial"/>
+                <w:color w:val="1F2A38"/>
+                <w:sz w:val="18"/>
+                <w:szCs w:val="18"/>
+              </w:rPr>
+              <w:t xml:space="preserve">•  Use 📏 Measure in the preview to read any dimension in nm; ⬡ Polygons… exports editable SVG/JSON.</w:t>
+            </w:r>
+          </w:p>
         </w:tc>
       </w:tr>
     </w:tbl>

</xml_diff>

<commit_message>
Tutorials: document all four shape treatments, clamping, and the version pill
The tutorials only ever explained Round and Taper, so users had no guidance on chamfer vs
facet (which prompted the question). Tutorial 1 now covers all four:
- Round = fillet (radius); Chamfer = fixed 45 degree corner clip (size); Facet = the same cut
  at ANY angle (depth + angle from the horizontal top) — a 45 degree facet IS a chamfer, so
  chamfer is simply the common preset; Taper = slopes the whole wall (angle from the base).
- Notes that a treatment larger than its layer is clamped to that layer (recent engine fix),
  so it eases into the wall instead of leaving a step.
- Tips mention the version pill / title bar so testers can quote their exact build.
Trimmed wording and panel sizes so all three tutorials stay one page each.
</commit_message>
<xml_diff>
--- a/docs/Tutorial-1-mask-profile.docx
+++ b/docs/Tutorial-1-mask-profile.docx
@@ -107,7 +107,7 @@
             <w:r>
               <w:drawing>
                 <wp:inline distT="0" distB="0" distL="0" distR="0">
-                  <wp:extent cx="2038350" cy="1600200"/>
+                  <wp:extent cx="1638300" cy="1285875"/>
                   <wp:effectExtent t="0" r="0" b="0" l="0"/>
                   <wp:docPr id="1" name="" descr="" title=""/>
                   <wp:cNvGraphicFramePr>
@@ -132,7 +132,7 @@
                         <pic:spPr bwMode="auto">
                           <a:xfrm>
                             <a:off x="0" y="0"/>
-                            <a:ext cx="2038350" cy="1600200"/>
+                            <a:ext cx="1638300" cy="1285875"/>
                           </a:xfrm>
                           <a:prstGeom prst="rect">
                             <a:avLst/>
@@ -208,7 +208,7 @@
             <w:r>
               <w:drawing>
                 <wp:inline distT="0" distB="0" distL="0" distR="0">
-                  <wp:extent cx="1257300" cy="1600200"/>
+                  <wp:extent cx="1009650" cy="1285875"/>
                   <wp:effectExtent t="0" r="0" b="0" l="0"/>
                   <wp:docPr id="1" name="" descr="" title=""/>
                   <wp:cNvGraphicFramePr>
@@ -233,7 +233,7 @@
                         <pic:spPr bwMode="auto">
                           <a:xfrm>
                             <a:off x="0" y="0"/>
-                            <a:ext cx="1257300" cy="1600200"/>
+                            <a:ext cx="1009650" cy="1285875"/>
                           </a:xfrm>
                           <a:prstGeom prst="rect">
                             <a:avLst/>
@@ -715,56 +715,16 @@
           <w:sz w:val="20"/>
           <w:szCs w:val="20"/>
         </w:rPr>
-        <w:t xml:space="preserve">Round</w:t>
-      </w:r>
-      <w:r>
-        <w:rPr>
-          <w:rFonts w:ascii="Arial" w:cs="Arial" w:eastAsia="Arial" w:hAnsi="Arial"/>
-          <w:color w:val="1F2A38"/>
-          <w:sz w:val="20"/>
-          <w:szCs w:val="20"/>
-        </w:rPr>
-        <w:t xml:space="preserve"> softens the top corner, </w:t>
-      </w:r>
-      <w:r>
-        <w:rPr>
-          <w:rFonts w:ascii="Arial" w:cs="Arial" w:eastAsia="Arial" w:hAnsi="Arial"/>
-          <w:b/>
-          <w:bCs/>
-          <w:color w:val="1F2A38"/>
-          <w:sz w:val="20"/>
-          <w:szCs w:val="20"/>
-        </w:rPr>
-        <w:t xml:space="preserve">Taper</w:t>
-      </w:r>
-      <w:r>
-        <w:rPr>
-          <w:rFonts w:ascii="Arial" w:cs="Arial" w:eastAsia="Arial" w:hAnsi="Arial"/>
-          <w:color w:val="1F2A38"/>
-          <w:sz w:val="20"/>
-          <w:szCs w:val="20"/>
-        </w:rPr>
-        <w:t xml:space="preserve"> slopes the whole wall, and </w:t>
-      </w:r>
-      <w:r>
-        <w:rPr>
-          <w:rFonts w:ascii="Arial" w:cs="Arial" w:eastAsia="Arial" w:hAnsi="Arial"/>
-          <w:b/>
-          <w:bCs/>
-          <w:color w:val="1F2A38"/>
-          <w:sz w:val="20"/>
-          <w:szCs w:val="20"/>
-        </w:rPr>
-        <w:t xml:space="preserve">Opening bottom round</w:t>
-      </w:r>
-      <w:r>
-        <w:rPr>
-          <w:rFonts w:ascii="Arial" w:cs="Arial" w:eastAsia="Arial" w:hAnsi="Arial"/>
-          <w:color w:val="1F2A38"/>
-          <w:sz w:val="20"/>
-          <w:szCs w:val="20"/>
-        </w:rPr>
-        <w:t xml:space="preserve"> curves the base — each shapes a different part.</w:t>
+        <w:t xml:space="preserve">Round (radius)</w:t>
+      </w:r>
+      <w:r>
+        <w:rPr>
+          <w:rFonts w:ascii="Arial" w:cs="Arial" w:eastAsia="Arial" w:hAnsi="Arial"/>
+          <w:color w:val="1F2A38"/>
+          <w:sz w:val="20"/>
+          <w:szCs w:val="20"/>
+        </w:rPr>
+        <w:t xml:space="preserve"> — a fillet: a quarter-circle taken off the top corner.</w:t>
       </w:r>
     </w:p>
     <w:p>
@@ -792,36 +752,56 @@
           <w:sz w:val="20"/>
           <w:szCs w:val="20"/>
         </w:rPr>
-        <w:t xml:space="preserve">Taper</w:t>
-      </w:r>
-      <w:r>
-        <w:rPr>
-          <w:rFonts w:ascii="Arial" w:cs="Arial" w:eastAsia="Arial" w:hAnsi="Arial"/>
-          <w:color w:val="1F2A38"/>
-          <w:sz w:val="20"/>
-          <w:szCs w:val="20"/>
-        </w:rPr>
-        <w:t xml:space="preserve"> angle is the sidewall angle from the horizontal base: </w:t>
-      </w:r>
-      <w:r>
-        <w:rPr>
-          <w:rFonts w:ascii="Arial" w:cs="Arial" w:eastAsia="Arial" w:hAnsi="Arial"/>
-          <w:b/>
-          <w:bCs/>
-          <w:color w:val="1F2A38"/>
-          <w:sz w:val="20"/>
-          <w:szCs w:val="20"/>
-        </w:rPr>
-        <w:t xml:space="preserve">90° = vertical</w:t>
-      </w:r>
-      <w:r>
-        <w:rPr>
-          <w:rFonts w:ascii="Arial" w:cs="Arial" w:eastAsia="Arial" w:hAnsi="Arial"/>
-          <w:color w:val="1F2A38"/>
-          <w:sz w:val="20"/>
-          <w:szCs w:val="20"/>
-        </w:rPr>
-        <w:t xml:space="preserve">, smaller = more sloped. (Not needed for this mask.)</w:t>
+        <w:t xml:space="preserve">Chamfer (size)</w:t>
+      </w:r>
+      <w:r>
+        <w:rPr>
+          <w:rFonts w:ascii="Arial" w:cs="Arial" w:eastAsia="Arial" w:hAnsi="Arial"/>
+          <w:color w:val="1F2A38"/>
+          <w:sz w:val="20"/>
+          <w:szCs w:val="20"/>
+        </w:rPr>
+        <w:t xml:space="preserve"> / </w:t>
+      </w:r>
+      <w:r>
+        <w:rPr>
+          <w:rFonts w:ascii="Arial" w:cs="Arial" w:eastAsia="Arial" w:hAnsi="Arial"/>
+          <w:b/>
+          <w:bCs/>
+          <w:color w:val="1F2A38"/>
+          <w:sz w:val="20"/>
+          <w:szCs w:val="20"/>
+        </w:rPr>
+        <w:t xml:space="preserve">Facet (angle + depth)</w:t>
+      </w:r>
+      <w:r>
+        <w:rPr>
+          <w:rFonts w:ascii="Arial" w:cs="Arial" w:eastAsia="Arial" w:hAnsi="Arial"/>
+          <w:color w:val="1F2A38"/>
+          <w:sz w:val="20"/>
+          <w:szCs w:val="20"/>
+        </w:rPr>
+        <w:t xml:space="preserve"> — straight-cut corners. Chamfer is a fixed </w:t>
+      </w:r>
+      <w:r>
+        <w:rPr>
+          <w:rFonts w:ascii="Arial" w:cs="Arial" w:eastAsia="Arial" w:hAnsi="Arial"/>
+          <w:b/>
+          <w:bCs/>
+          <w:color w:val="1F2A38"/>
+          <w:sz w:val="20"/>
+          <w:szCs w:val="20"/>
+        </w:rPr>
+        <w:t xml:space="preserve">45°</w:t>
+      </w:r>
+      <w:r>
+        <w:rPr>
+          <w:rFonts w:ascii="Arial" w:cs="Arial" w:eastAsia="Arial" w:hAnsi="Arial"/>
+          <w:color w:val="1F2A38"/>
+          <w:sz w:val="20"/>
+          <w:szCs w:val="20"/>
+        </w:rPr>
+        <w:t xml:space="preserve"> clip; facet does the same at any angle (depth = how far down the wall, angle measured from the horizontal top). A 45° facet is exactly a chamfer.</w:t>
       </w:r>
     </w:p>
     <w:p>
@@ -843,6 +823,149 @@
       <w:r>
         <w:rPr>
           <w:rFonts w:ascii="Arial" w:cs="Arial" w:eastAsia="Arial" w:hAnsi="Arial"/>
+          <w:b/>
+          <w:bCs/>
+          <w:color w:val="1F2A38"/>
+          <w:sz w:val="20"/>
+          <w:szCs w:val="20"/>
+        </w:rPr>
+        <w:t xml:space="preserve">Taper (angle)</w:t>
+      </w:r>
+      <w:r>
+        <w:rPr>
+          <w:rFonts w:ascii="Arial" w:cs="Arial" w:eastAsia="Arial" w:hAnsi="Arial"/>
+          <w:color w:val="1F2A38"/>
+          <w:sz w:val="20"/>
+          <w:szCs w:val="20"/>
+        </w:rPr>
+        <w:t xml:space="preserve"> — slopes the </w:t>
+      </w:r>
+      <w:r>
+        <w:rPr>
+          <w:rFonts w:ascii="Arial" w:cs="Arial" w:eastAsia="Arial" w:hAnsi="Arial"/>
+          <w:b/>
+          <w:bCs/>
+          <w:color w:val="1F2A38"/>
+          <w:sz w:val="20"/>
+          <w:szCs w:val="20"/>
+        </w:rPr>
+        <w:t xml:space="preserve">whole</w:t>
+      </w:r>
+      <w:r>
+        <w:rPr>
+          <w:rFonts w:ascii="Arial" w:cs="Arial" w:eastAsia="Arial" w:hAnsi="Arial"/>
+          <w:color w:val="1F2A38"/>
+          <w:sz w:val="20"/>
+          <w:szCs w:val="20"/>
+        </w:rPr>
+        <w:t xml:space="preserve"> layer wall, not just the corner. Its angle is measured from the horizontal </w:t>
+      </w:r>
+      <w:r>
+        <w:rPr>
+          <w:rFonts w:ascii="Arial" w:cs="Arial" w:eastAsia="Arial" w:hAnsi="Arial"/>
+          <w:b/>
+          <w:bCs/>
+          <w:color w:val="1F2A38"/>
+          <w:sz w:val="20"/>
+          <w:szCs w:val="20"/>
+        </w:rPr>
+        <w:t xml:space="preserve">base</w:t>
+      </w:r>
+      <w:r>
+        <w:rPr>
+          <w:rFonts w:ascii="Arial" w:cs="Arial" w:eastAsia="Arial" w:hAnsi="Arial"/>
+          <w:color w:val="1F2A38"/>
+          <w:sz w:val="20"/>
+          <w:szCs w:val="20"/>
+        </w:rPr>
+        <w:t xml:space="preserve">: </w:t>
+      </w:r>
+      <w:r>
+        <w:rPr>
+          <w:rFonts w:ascii="Arial" w:cs="Arial" w:eastAsia="Arial" w:hAnsi="Arial"/>
+          <w:b/>
+          <w:bCs/>
+          <w:color w:val="1F2A38"/>
+          <w:sz w:val="20"/>
+          <w:szCs w:val="20"/>
+        </w:rPr>
+        <w:t xml:space="preserve">90° = vertical</w:t>
+      </w:r>
+      <w:r>
+        <w:rPr>
+          <w:rFonts w:ascii="Arial" w:cs="Arial" w:eastAsia="Arial" w:hAnsi="Arial"/>
+          <w:color w:val="1F2A38"/>
+          <w:sz w:val="20"/>
+          <w:szCs w:val="20"/>
+        </w:rPr>
+        <w:t xml:space="preserve">, smaller = more sloped.</w:t>
+      </w:r>
+    </w:p>
+    <w:p>
+      <w:pPr>
+        <w:spacing w:after="60"/>
+        <w:ind w:left="120"/>
+      </w:pPr>
+      <w:r>
+        <w:rPr>
+          <w:rFonts w:ascii="Arial" w:cs="Arial" w:eastAsia="Arial" w:hAnsi="Arial"/>
+          <w:b/>
+          <w:bCs/>
+          <w:color w:val="2E9E77"/>
+          <w:sz w:val="20"/>
+          <w:szCs w:val="20"/>
+        </w:rPr>
+        <w:t xml:space="preserve">•  </w:t>
+      </w:r>
+      <w:r>
+        <w:rPr>
+          <w:rFonts w:ascii="Arial" w:cs="Arial" w:eastAsia="Arial" w:hAnsi="Arial"/>
+          <w:color w:val="1F2A38"/>
+          <w:sz w:val="20"/>
+          <w:szCs w:val="20"/>
+        </w:rPr>
+        <w:t xml:space="preserve">A treatment larger than its layer is </w:t>
+      </w:r>
+      <w:r>
+        <w:rPr>
+          <w:rFonts w:ascii="Arial" w:cs="Arial" w:eastAsia="Arial" w:hAnsi="Arial"/>
+          <w:b/>
+          <w:bCs/>
+          <w:color w:val="1F2A38"/>
+          <w:sz w:val="20"/>
+          <w:szCs w:val="20"/>
+        </w:rPr>
+        <w:t xml:space="preserve">clamped to that layer</w:t>
+      </w:r>
+      <w:r>
+        <w:rPr>
+          <w:rFonts w:ascii="Arial" w:cs="Arial" w:eastAsia="Arial" w:hAnsi="Arial"/>
+          <w:color w:val="1F2A38"/>
+          <w:sz w:val="20"/>
+          <w:szCs w:val="20"/>
+        </w:rPr>
+        <w:t xml:space="preserve">, so it eases into the wall instead of leaving a step.</w:t>
+      </w:r>
+    </w:p>
+    <w:p>
+      <w:pPr>
+        <w:spacing w:after="60"/>
+        <w:ind w:left="120"/>
+      </w:pPr>
+      <w:r>
+        <w:rPr>
+          <w:rFonts w:ascii="Arial" w:cs="Arial" w:eastAsia="Arial" w:hAnsi="Arial"/>
+          <w:b/>
+          <w:bCs/>
+          <w:color w:val="2E9E77"/>
+          <w:sz w:val="20"/>
+          <w:szCs w:val="20"/>
+        </w:rPr>
+        <w:t xml:space="preserve">•  </w:t>
+      </w:r>
+      <w:r>
+        <w:rPr>
+          <w:rFonts w:ascii="Arial" w:cs="Arial" w:eastAsia="Arial" w:hAnsi="Arial"/>
           <w:color w:val="1F2A38"/>
           <w:sz w:val="20"/>
           <w:szCs w:val="20"/>
@@ -867,27 +990,7 @@
           <w:sz w:val="20"/>
           <w:szCs w:val="20"/>
         </w:rPr>
-        <w:t xml:space="preserve"> on one layer — e.g. </w:t>
-      </w:r>
-      <w:r>
-        <w:rPr>
-          <w:rFonts w:ascii="Arial" w:cs="Arial" w:eastAsia="Arial" w:hAnsi="Arial"/>
-          <w:b/>
-          <w:bCs/>
-          <w:color w:val="1F2A38"/>
-          <w:sz w:val="20"/>
-          <w:szCs w:val="20"/>
-        </w:rPr>
-        <w:t xml:space="preserve">Round + Taper</w:t>
-      </w:r>
-      <w:r>
-        <w:rPr>
-          <w:rFonts w:ascii="Arial" w:cs="Arial" w:eastAsia="Arial" w:hAnsi="Arial"/>
-          <w:color w:val="1F2A38"/>
-          <w:sz w:val="20"/>
-          <w:szCs w:val="20"/>
-        </w:rPr>
-        <w:t xml:space="preserve">. Use </w:t>
+        <w:t xml:space="preserve"> on one layer (e.g. Round + Taper) via </w:t>
       </w:r>
       <w:r>
         <w:rPr>
@@ -907,7 +1010,7 @@
           <w:sz w:val="20"/>
           <w:szCs w:val="20"/>
         </w:rPr>
-        <w:t xml:space="preserve"> in the shape dialog. They combine and are order-independent.</w:t>
+        <w:t xml:space="preserve"> — they combine and are order-independent.</w:t>
       </w:r>
     </w:p>
     <w:p>
@@ -1026,7 +1129,7 @@
           <w:sz w:val="20"/>
           <w:szCs w:val="20"/>
         </w:rPr>
-        <w:t xml:space="preserve"> — once zoomed in, the cursor becomes a move cursor: drag, or use the arrow keys, to reposition. (At 1x there is nothing to move — the whole profile is already in view.)</w:t>
+        <w:t xml:space="preserve"> — once zoomed in, drag (or use the arrow keys) to reposition. At 1× the whole profile is already in view, so there is nothing to move.</w:t>
       </w:r>
     </w:p>
     <w:p>
@@ -1063,7 +1166,7 @@
           <w:sz w:val="20"/>
           <w:szCs w:val="20"/>
         </w:rPr>
-        <w:t xml:space="preserve"> — switch to the Measure tool and drag a line across any feature to read its length in nm. Set </w:t>
+        <w:t xml:space="preserve"> — drag a line across any feature to read it in nm. Set </w:t>
       </w:r>
       <w:r>
         <w:rPr>
@@ -1083,7 +1186,7 @@
           <w:sz w:val="20"/>
           <w:szCs w:val="20"/>
         </w:rPr>
-        <w:t xml:space="preserve"> to Edge or Vertex to lock the endpoints onto material boundaries. Switch back to </w:t>
+        <w:t xml:space="preserve"> to Edge/Vertex to lock endpoints onto material boundaries. Switch back to </w:t>
       </w:r>
       <w:r>
         <w:rPr>
@@ -1103,7 +1206,7 @@
           <w:sz w:val="20"/>
           <w:szCs w:val="20"/>
         </w:rPr>
-        <w:t xml:space="preserve"> to pan again.</w:t>
+        <w:t xml:space="preserve"> to pan.</w:t>
       </w:r>
     </w:p>
     <w:p>
@@ -1140,7 +1243,7 @@
           <w:sz w:val="20"/>
           <w:szCs w:val="20"/>
         </w:rPr>
-        <w:t xml:space="preserve"> (Off / 2x / 4x / 8x) de-jags curved walls. It never blends colours: the .bmp always contains exactly one colour per material.</w:t>
+        <w:t xml:space="preserve"> (Off / 2× / 4× / 8×) de-jags curved walls without ever blending colours — the .bmp keeps exactly one colour per material.</w:t>
       </w:r>
     </w:p>
     <w:p>
@@ -1267,7 +1370,7 @@
                 <w:sz w:val="18"/>
                 <w:szCs w:val="18"/>
               </w:rPr>
-              <w:t xml:space="preserve">•  The window starts maximised and is resizable — drag it larger and the preview grows with it.</w:t>
+              <w:t xml:space="preserve">•  The version pill (top-right) and title bar show your build — quote it when reporting an issue.</w:t>
             </w:r>
           </w:p>
           <w:p>
@@ -1282,7 +1385,7 @@
                 <w:sz w:val="18"/>
                 <w:szCs w:val="18"/>
               </w:rPr>
-              <w:t xml:space="preserve">•  The plot grid keeps a fixed size — only the axis numbers change as you edit.</w:t>
+              <w:t xml:space="preserve">•  The window starts maximised and is resizable; the preview grows with it. The plot grid itself stays a fixed size — only the axis numbers change.</w:t>
             </w:r>
           </w:p>
           <w:p>
@@ -1297,37 +1400,7 @@
                 <w:sz w:val="18"/>
                 <w:szCs w:val="18"/>
               </w:rPr>
-              <w:t xml:space="preserve">•  The shape button on a layer row is enabled only for layers the opening actually reaches.</w:t>
-            </w:r>
-          </w:p>
-          <w:p>
-            <w:pPr>
-              <w:spacing w:before="24"/>
-              <w:ind w:left="80"/>
-            </w:pPr>
-            <w:r>
-              <w:rPr>
-                <w:rFonts w:ascii="Arial" w:cs="Arial" w:eastAsia="Arial" w:hAnsi="Arial"/>
-                <w:color w:val="1F2A38"/>
-                <w:sz w:val="18"/>
-                <w:szCs w:val="18"/>
-              </w:rPr>
-              <w:t xml:space="preserve">•  Toolbar Save stores the whole project; Save .bmp exports just the picture.</w:t>
-            </w:r>
-          </w:p>
-          <w:p>
-            <w:pPr>
-              <w:spacing w:before="24"/>
-              <w:ind w:left="80"/>
-            </w:pPr>
-            <w:r>
-              <w:rPr>
-                <w:rFonts w:ascii="Arial" w:cs="Arial" w:eastAsia="Arial" w:hAnsi="Arial"/>
-                <w:color w:val="1F2A38"/>
-                <w:sz w:val="18"/>
-                <w:szCs w:val="18"/>
-              </w:rPr>
-              <w:t xml:space="preserve">•  Add your own colors with the “＋ New material (color)” button.</w:t>
+              <w:t xml:space="preserve">•  Toolbar Save stores the whole project; Save .bmp exports just the picture. Add your own colours with “＋ New material (color)”.</w:t>
             </w:r>
           </w:p>
         </w:tc>

</xml_diff>

<commit_message>
Assign material colours by hex code + make tutorials reproducible
- The 'New material (color)' dialog now has a Hex field alongside the colour picker. Type
  #4FD093 / 4fd093 / short #4d9 (whitespace ok); the swatch updates live and flags invalid
  codes, and the picker and hex field stay in sync. A typed hex is honoured on Add even if the
  field wasn't blurred. _parse_hex is covered by tests (valid forms, bad input, palette
  round-trip).
- Tutorials: tip now notes you can type a hex code.
- Reproducibility fix: the tutorial preview images were loose scratch files outside the repo,
  so the build broke whenever the workspace reset. They're now generated by
  tools/gen_tutorial_images.py from the engine and committed under docs/tutorial_img/, and
  build_all_tutorials.js reads from there. 83 tests.
</commit_message>
<xml_diff>
--- a/docs/Tutorial-1-mask-profile.docx
+++ b/docs/Tutorial-1-mask-profile.docx
@@ -224,7 +224,7 @@
                           </pic:cNvPicPr>
                         </pic:nvPicPr>
                         <pic:blipFill>
-                          <a:blip r:embed="rId8" cstate="none"/>
+                          <a:blip r:embed="rId7" cstate="none"/>
                           <a:srcRect/>
                           <a:stretch>
                             <a:fillRect/>
@@ -1400,7 +1400,7 @@
                 <w:sz w:val="18"/>
                 <w:szCs w:val="18"/>
               </w:rPr>
-              <w:t xml:space="preserve">•  Toolbar Save stores the whole project; Save .bmp exports just the picture. Add your own colours with “＋ New material (color)”.</w:t>
+              <w:t xml:space="preserve">•  Toolbar Save stores the whole project; Save .bmp exports just the picture. Add your own colours with “＋ New material (color)” — pick a swatch or type a hex code.</w:t>
             </w:r>
           </w:p>
         </w:tc>

</xml_diff>